<commit_message>
Police Press DF modifications
</commit_message>
<xml_diff>
--- a/Gen AI Usage Journal.docx
+++ b/Gen AI Usage Journal.docx
@@ -2,6 +2,27 @@
 <file path=word/document.xml><?xml version="1.0" encoding="utf-8"?>
 <w:document xmlns:wpc="http://schemas.microsoft.com/office/word/2010/wordprocessingCanvas" xmlns:cx="http://schemas.microsoft.com/office/drawing/2014/chartex" xmlns:cx1="http://schemas.microsoft.com/office/drawing/2015/9/8/chartex" xmlns:cx2="http://schemas.microsoft.com/office/drawing/2015/10/21/chartex" xmlns:cx3="http://schemas.microsoft.com/office/drawing/2016/5/9/chartex" xmlns:cx4="http://schemas.microsoft.com/office/drawing/2016/5/10/chartex" xmlns:cx5="http://schemas.microsoft.com/office/drawing/2016/5/11/chartex" xmlns:cx6="http://schemas.microsoft.com/office/drawing/2016/5/12/chartex" xmlns:cx7="http://schemas.microsoft.com/office/drawing/2016/5/13/chartex" xmlns:cx8="http://schemas.microsoft.com/office/drawing/2016/5/14/chartex" xmlns:mc="http://schemas.openxmlformats.org/markup-compatibility/2006" xmlns:aink="http://schemas.microsoft.com/office/drawing/2016/ink" xmlns:am3d="http://schemas.microsoft.com/office/drawing/2017/model3d" xmlns:o="urn:schemas-microsoft-com:office:office" xmlns:oel="http://schemas.microsoft.com/office/2019/extlst" xmlns:r="http://schemas.openxmlformats.org/officeDocument/2006/relationships" xmlns:m="http://schemas.openxmlformats.org/officeDocument/2006/math" xmlns:v="urn:schemas-microsoft-com:vml" xmlns:wp14="http://schemas.microsoft.com/office/word/2010/wordprocessingDrawing" xmlns:wp="http://schemas.openxmlformats.org/drawingml/2006/wordprocessingDrawing" xmlns:w10="urn:schemas-microsoft-com:office:word" xmlns:w="http://schemas.openxmlformats.org/wordprocessingml/2006/main" xmlns:w14="http://schemas.microsoft.com/office/word/2010/wordml" xmlns:w15="http://schemas.microsoft.com/office/word/2012/wordml" xmlns:w16cex="http://schemas.microsoft.com/office/word/2018/wordml/cex" xmlns:w16cid="http://schemas.microsoft.com/office/word/2016/wordml/cid" xmlns:w16="http://schemas.microsoft.com/office/word/2018/wordml" xmlns:w16du="http://schemas.microsoft.com/office/word/2023/wordml/word16du" xmlns:w16sdtdh="http://schemas.microsoft.com/office/word/2020/wordml/sdtdatahash" xmlns:w16sdtfl="http://schemas.microsoft.com/office/word/2024/wordml/sdtformatlock" xmlns:w16se="http://schemas.microsoft.com/office/word/2015/wordml/symex" xmlns:wpg="http://schemas.microsoft.com/office/word/2010/wordprocessingGroup" xmlns:wpi="http://schemas.microsoft.com/office/word/2010/wordprocessingInk" xmlns:wne="http://schemas.microsoft.com/office/word/2006/wordml" xmlns:wps="http://schemas.microsoft.com/office/word/2010/wordprocessingShape" mc:Ignorable="w14 w15 w16se w16cid w16 w16cex w16sdtdh w16sdtfl w16du wp14">
   <w:body>
+    <w:p>
+      <w:pPr>
+        <w:rPr>
+          <w:b/>
+          <w:bCs/>
+          <w:sz w:val="36"/>
+          <w:szCs w:val="36"/>
+          <w:lang w:val="en-US"/>
+        </w:rPr>
+      </w:pPr>
+      <w:r>
+        <w:rPr>
+          <w:b/>
+          <w:bCs/>
+          <w:sz w:val="36"/>
+          <w:szCs w:val="36"/>
+          <w:lang w:val="en-US"/>
+        </w:rPr>
+        <w:t>Luca Alfino</w:t>
+      </w:r>
+    </w:p>
     <w:p>
       <w:pPr>
         <w:rPr>
@@ -28,6 +49,19 @@
         </w:rPr>
         <w:t>ChatGPT</w:t>
       </w:r>
+      <w:r>
+        <w:rPr>
+          <w:b/>
+          <w:bCs/>
+          <w:i/>
+          <w:iCs/>
+          <w:sz w:val="28"/>
+          <w:szCs w:val="28"/>
+          <w:u w:val="single"/>
+          <w:lang w:val="en-US"/>
+        </w:rPr>
+        <w:t xml:space="preserve"> – 20/11/2025</w:t>
+      </w:r>
     </w:p>
     <w:p>
       <w:pPr>
@@ -40,6 +74,106 @@
           <w:lang w:val="en-US"/>
         </w:rPr>
         <w:t>I have used ChatGPT to help me format the README properly for readability on GitHub.</w:t>
+      </w:r>
+    </w:p>
+    <w:p>
+      <w:pPr>
+        <w:rPr>
+          <w:lang w:val="en-US"/>
+        </w:rPr>
+      </w:pPr>
+    </w:p>
+    <w:p>
+      <w:pPr>
+        <w:rPr>
+          <w:b/>
+          <w:bCs/>
+          <w:i/>
+          <w:iCs/>
+          <w:sz w:val="28"/>
+          <w:szCs w:val="28"/>
+          <w:u w:val="single"/>
+          <w:lang w:val="en-US"/>
+        </w:rPr>
+      </w:pPr>
+      <w:r>
+        <w:rPr>
+          <w:b/>
+          <w:bCs/>
+          <w:i/>
+          <w:iCs/>
+          <w:sz w:val="28"/>
+          <w:szCs w:val="28"/>
+          <w:u w:val="single"/>
+          <w:lang w:val="en-US"/>
+        </w:rPr>
+        <w:t>Google Gemini</w:t>
+      </w:r>
+      <w:r>
+        <w:rPr>
+          <w:b/>
+          <w:bCs/>
+          <w:i/>
+          <w:iCs/>
+          <w:sz w:val="28"/>
+          <w:szCs w:val="28"/>
+          <w:u w:val="single"/>
+          <w:lang w:val="en-US"/>
+        </w:rPr>
+        <w:t xml:space="preserve"> – 2</w:t>
+      </w:r>
+      <w:r>
+        <w:rPr>
+          <w:b/>
+          <w:bCs/>
+          <w:i/>
+          <w:iCs/>
+          <w:sz w:val="28"/>
+          <w:szCs w:val="28"/>
+          <w:u w:val="single"/>
+          <w:lang w:val="en-US"/>
+        </w:rPr>
+        <w:t>2</w:t>
+      </w:r>
+      <w:r>
+        <w:rPr>
+          <w:b/>
+          <w:bCs/>
+          <w:i/>
+          <w:iCs/>
+          <w:sz w:val="28"/>
+          <w:szCs w:val="28"/>
+          <w:u w:val="single"/>
+          <w:lang w:val="en-US"/>
+        </w:rPr>
+        <w:t>/11/2025</w:t>
+      </w:r>
+    </w:p>
+    <w:p>
+      <w:pPr>
+        <w:rPr>
+          <w:lang w:val="en-US"/>
+        </w:rPr>
+      </w:pPr>
+      <w:r>
+        <w:rPr>
+          <w:lang w:val="en-US"/>
+        </w:rPr>
+        <w:t xml:space="preserve">Although I am familiar with one hot-encoding as a method for feature encoding, this does not work for the datasets provided due to the amount of information in the content. Hence, I have utilized Google Gemini for other potential </w:t>
+      </w:r>
+      <w:proofErr w:type="gramStart"/>
+      <w:r>
+        <w:rPr>
+          <w:lang w:val="en-US"/>
+        </w:rPr>
+        <w:t>feature</w:t>
+      </w:r>
+      <w:proofErr w:type="gramEnd"/>
+      <w:r>
+        <w:rPr>
+          <w:lang w:val="en-US"/>
+        </w:rPr>
+        <w:t xml:space="preserve"> encoding methods that work best for this use case.</w:t>
       </w:r>
     </w:p>
     <w:sectPr>

</xml_diff>

<commit_message>
Fully cleaned datasets and merged
</commit_message>
<xml_diff>
--- a/Gen AI Usage Journal.docx
+++ b/Gen AI Usage Journal.docx
@@ -155,6 +155,40 @@
           <w:lang w:val="en-US"/>
         </w:rPr>
         <w:t>What to do for missing data in dataset 1 compared to dataset 2</w:t>
+      </w:r>
+      <w:r>
+        <w:rPr>
+          <w:lang w:val="en-US"/>
+        </w:rPr>
+        <w:t xml:space="preserve">, help in function </w:t>
+      </w:r>
+      <w:proofErr w:type="spellStart"/>
+      <w:r>
+        <w:rPr>
+          <w:lang w:val="en-US"/>
+        </w:rPr>
+        <w:t>assign_tags</w:t>
+      </w:r>
+      <w:proofErr w:type="spellEnd"/>
+      <w:r>
+        <w:rPr>
+          <w:lang w:val="en-US"/>
+        </w:rPr>
+        <w:t xml:space="preserve"> for police dataset &amp; one-hot encoding tags for </w:t>
+      </w:r>
+      <w:proofErr w:type="spellStart"/>
+      <w:r>
+        <w:rPr>
+          <w:lang w:val="en-US"/>
+        </w:rPr>
+        <w:t>local_news_article</w:t>
+      </w:r>
+      <w:proofErr w:type="spellEnd"/>
+      <w:r>
+        <w:rPr>
+          <w:lang w:val="en-US"/>
+        </w:rPr>
+        <w:t>. (Will polish this)</w:t>
       </w:r>
     </w:p>
     <w:sectPr>

</xml_diff>

<commit_message>
Updated Gen AI journal
</commit_message>
<xml_diff>
--- a/Gen AI Usage Journal.docx
+++ b/Gen AI Usage Journal.docx
@@ -120,21 +120,7 @@
         <w:rPr>
           <w:lang w:val="en-US"/>
         </w:rPr>
-        <w:t xml:space="preserve">Although I am familiar with one hot-encoding as a method for feature encoding, this does not work for the datasets provided due to the amount of information in the content. Hence, I have utilized Google Gemini for other potential </w:t>
-      </w:r>
-      <w:proofErr w:type="gramStart"/>
-      <w:r>
-        <w:rPr>
-          <w:lang w:val="en-US"/>
-        </w:rPr>
-        <w:t>feature</w:t>
-      </w:r>
-      <w:proofErr w:type="gramEnd"/>
-      <w:r>
-        <w:rPr>
-          <w:lang w:val="en-US"/>
-        </w:rPr>
-        <w:t xml:space="preserve"> encoding methods that work best for this use case.</w:t>
+        <w:t>I find Google Gemini to be useful in writing code snippets for functions/quick short code. Hence, I utilized it for variables/functions:</w:t>
       </w:r>
     </w:p>
     <w:p>
@@ -146,49 +132,68 @@
     </w:p>
     <w:p>
       <w:pPr>
-        <w:rPr>
-          <w:lang w:val="en-US"/>
-        </w:rPr>
-      </w:pPr>
-      <w:r>
-        <w:rPr>
-          <w:lang w:val="en-US"/>
-        </w:rPr>
-        <w:t>What to do for missing data in dataset 1 compared to dataset 2</w:t>
-      </w:r>
-      <w:r>
-        <w:rPr>
-          <w:lang w:val="en-US"/>
-        </w:rPr>
-        <w:t xml:space="preserve">, help in function </w:t>
-      </w:r>
+        <w:pStyle w:val="ListParagraph"/>
+        <w:numPr>
+          <w:ilvl w:val="0"/>
+          <w:numId w:val="1"/>
+        </w:numPr>
+        <w:rPr>
+          <w:lang w:val="en-MT"/>
+        </w:rPr>
+      </w:pPr>
       <w:proofErr w:type="spellStart"/>
       <w:r>
         <w:rPr>
-          <w:lang w:val="en-US"/>
+          <w:lang w:val="en-MT"/>
+        </w:rPr>
+        <w:t>merged_df_police_press</w:t>
+      </w:r>
+      <w:proofErr w:type="spellEnd"/>
+      <w:r>
+        <w:rPr>
+          <w:lang w:val="en-MT"/>
+        </w:rPr>
+        <w:t xml:space="preserve"> (Lambda expression comparison)</w:t>
+      </w:r>
+    </w:p>
+    <w:p>
+      <w:pPr>
+        <w:pStyle w:val="ListParagraph"/>
+        <w:numPr>
+          <w:ilvl w:val="0"/>
+          <w:numId w:val="1"/>
+        </w:numPr>
+        <w:rPr>
+          <w:lang w:val="en-MT"/>
+        </w:rPr>
+      </w:pPr>
+      <w:proofErr w:type="spellStart"/>
+      <w:r>
+        <w:rPr>
+          <w:lang w:val="en-MT"/>
         </w:rPr>
         <w:t>assign_tags</w:t>
       </w:r>
       <w:proofErr w:type="spellEnd"/>
       <w:r>
         <w:rPr>
-          <w:lang w:val="en-US"/>
-        </w:rPr>
-        <w:t xml:space="preserve"> for police dataset &amp; one-hot encoding tags for </w:t>
+          <w:lang w:val="en-MT"/>
+        </w:rPr>
+        <w:t xml:space="preserve"> function (Extract top 5 tags and their </w:t>
       </w:r>
       <w:proofErr w:type="spellStart"/>
       <w:r>
         <w:rPr>
-          <w:lang w:val="en-US"/>
-        </w:rPr>
-        <w:t>local_news_article</w:t>
+          <w:lang w:val="en-MT"/>
+        </w:rPr>
+        <w:t>freq</w:t>
       </w:r>
       <w:proofErr w:type="spellEnd"/>
       <w:r>
         <w:rPr>
-          <w:lang w:val="en-US"/>
-        </w:rPr>
-        <w:t>. (Will polish this)</w:t>
+          <w:lang w:val="en-MT"/>
+        </w:rPr>
+        <w:t xml:space="preserve"> from first dataset)</w:t>
       </w:r>
     </w:p>
     <w:sectPr>
@@ -199,6 +204,127 @@
     </w:sectPr>
   </w:body>
 </w:document>
+</file>
+
+<file path=word/numbering.xml><?xml version="1.0" encoding="utf-8"?>
+<w:numbering xmlns:wpc="http://schemas.microsoft.com/office/word/2010/wordprocessingCanvas" xmlns:cx="http://schemas.microsoft.com/office/drawing/2014/chartex" xmlns:cx1="http://schemas.microsoft.com/office/drawing/2015/9/8/chartex" xmlns:cx2="http://schemas.microsoft.com/office/drawing/2015/10/21/chartex" xmlns:cx3="http://schemas.microsoft.com/office/drawing/2016/5/9/chartex" xmlns:cx4="http://schemas.microsoft.com/office/drawing/2016/5/10/chartex" xmlns:cx5="http://schemas.microsoft.com/office/drawing/2016/5/11/chartex" xmlns:cx6="http://schemas.microsoft.com/office/drawing/2016/5/12/chartex" xmlns:cx7="http://schemas.microsoft.com/office/drawing/2016/5/13/chartex" xmlns:cx8="http://schemas.microsoft.com/office/drawing/2016/5/14/chartex" xmlns:mc="http://schemas.openxmlformats.org/markup-compatibility/2006" xmlns:aink="http://schemas.microsoft.com/office/drawing/2016/ink" xmlns:am3d="http://schemas.microsoft.com/office/drawing/2017/model3d" xmlns:o="urn:schemas-microsoft-com:office:office" xmlns:oel="http://schemas.microsoft.com/office/2019/extlst" xmlns:r="http://schemas.openxmlformats.org/officeDocument/2006/relationships" xmlns:m="http://schemas.openxmlformats.org/officeDocument/2006/math" xmlns:v="urn:schemas-microsoft-com:vml" xmlns:wp14="http://schemas.microsoft.com/office/word/2010/wordprocessingDrawing" xmlns:wp="http://schemas.openxmlformats.org/drawingml/2006/wordprocessingDrawing" xmlns:w10="urn:schemas-microsoft-com:office:word" xmlns:w="http://schemas.openxmlformats.org/wordprocessingml/2006/main" xmlns:w14="http://schemas.microsoft.com/office/word/2010/wordml" xmlns:w15="http://schemas.microsoft.com/office/word/2012/wordml" xmlns:w16cex="http://schemas.microsoft.com/office/word/2018/wordml/cex" xmlns:w16cid="http://schemas.microsoft.com/office/word/2016/wordml/cid" xmlns:w16="http://schemas.microsoft.com/office/word/2018/wordml" xmlns:w16du="http://schemas.microsoft.com/office/word/2023/wordml/word16du" xmlns:w16sdtdh="http://schemas.microsoft.com/office/word/2020/wordml/sdtdatahash" xmlns:w16sdtfl="http://schemas.microsoft.com/office/word/2024/wordml/sdtformatlock" xmlns:w16se="http://schemas.microsoft.com/office/word/2015/wordml/symex" xmlns:wpg="http://schemas.microsoft.com/office/word/2010/wordprocessingGroup" xmlns:wpi="http://schemas.microsoft.com/office/word/2010/wordprocessingInk" xmlns:wne="http://schemas.microsoft.com/office/word/2006/wordml" xmlns:wps="http://schemas.microsoft.com/office/word/2010/wordprocessingShape" mc:Ignorable="w14 w15 w16se w16cid w16 w16cex w16sdtdh w16sdtfl w16du wp14">
+  <w:abstractNum w:abstractNumId="0" w15:restartNumberingAfterBreak="0">
+    <w:nsid w:val="02C029D1"/>
+    <w:multiLevelType w:val="hybridMultilevel"/>
+    <w:tmpl w:val="FEAA79E6"/>
+    <w:lvl w:ilvl="0" w:tplc="20000001">
+      <w:start w:val="1"/>
+      <w:numFmt w:val="bullet"/>
+      <w:lvlText w:val=""/>
+      <w:lvlJc w:val="left"/>
+      <w:pPr>
+        <w:ind w:left="720" w:hanging="360"/>
+      </w:pPr>
+      <w:rPr>
+        <w:rFonts w:ascii="Symbol" w:hAnsi="Symbol" w:hint="default"/>
+      </w:rPr>
+    </w:lvl>
+    <w:lvl w:ilvl="1" w:tplc="20000003" w:tentative="1">
+      <w:start w:val="1"/>
+      <w:numFmt w:val="bullet"/>
+      <w:lvlText w:val="o"/>
+      <w:lvlJc w:val="left"/>
+      <w:pPr>
+        <w:ind w:left="1440" w:hanging="360"/>
+      </w:pPr>
+      <w:rPr>
+        <w:rFonts w:ascii="Courier New" w:hAnsi="Courier New" w:cs="Courier New" w:hint="default"/>
+      </w:rPr>
+    </w:lvl>
+    <w:lvl w:ilvl="2" w:tplc="20000005" w:tentative="1">
+      <w:start w:val="1"/>
+      <w:numFmt w:val="bullet"/>
+      <w:lvlText w:val=""/>
+      <w:lvlJc w:val="left"/>
+      <w:pPr>
+        <w:ind w:left="2160" w:hanging="360"/>
+      </w:pPr>
+      <w:rPr>
+        <w:rFonts w:ascii="Wingdings" w:hAnsi="Wingdings" w:hint="default"/>
+      </w:rPr>
+    </w:lvl>
+    <w:lvl w:ilvl="3" w:tplc="20000001" w:tentative="1">
+      <w:start w:val="1"/>
+      <w:numFmt w:val="bullet"/>
+      <w:lvlText w:val=""/>
+      <w:lvlJc w:val="left"/>
+      <w:pPr>
+        <w:ind w:left="2880" w:hanging="360"/>
+      </w:pPr>
+      <w:rPr>
+        <w:rFonts w:ascii="Symbol" w:hAnsi="Symbol" w:hint="default"/>
+      </w:rPr>
+    </w:lvl>
+    <w:lvl w:ilvl="4" w:tplc="20000003" w:tentative="1">
+      <w:start w:val="1"/>
+      <w:numFmt w:val="bullet"/>
+      <w:lvlText w:val="o"/>
+      <w:lvlJc w:val="left"/>
+      <w:pPr>
+        <w:ind w:left="3600" w:hanging="360"/>
+      </w:pPr>
+      <w:rPr>
+        <w:rFonts w:ascii="Courier New" w:hAnsi="Courier New" w:cs="Courier New" w:hint="default"/>
+      </w:rPr>
+    </w:lvl>
+    <w:lvl w:ilvl="5" w:tplc="20000005" w:tentative="1">
+      <w:start w:val="1"/>
+      <w:numFmt w:val="bullet"/>
+      <w:lvlText w:val=""/>
+      <w:lvlJc w:val="left"/>
+      <w:pPr>
+        <w:ind w:left="4320" w:hanging="360"/>
+      </w:pPr>
+      <w:rPr>
+        <w:rFonts w:ascii="Wingdings" w:hAnsi="Wingdings" w:hint="default"/>
+      </w:rPr>
+    </w:lvl>
+    <w:lvl w:ilvl="6" w:tplc="20000001" w:tentative="1">
+      <w:start w:val="1"/>
+      <w:numFmt w:val="bullet"/>
+      <w:lvlText w:val=""/>
+      <w:lvlJc w:val="left"/>
+      <w:pPr>
+        <w:ind w:left="5040" w:hanging="360"/>
+      </w:pPr>
+      <w:rPr>
+        <w:rFonts w:ascii="Symbol" w:hAnsi="Symbol" w:hint="default"/>
+      </w:rPr>
+    </w:lvl>
+    <w:lvl w:ilvl="7" w:tplc="20000003" w:tentative="1">
+      <w:start w:val="1"/>
+      <w:numFmt w:val="bullet"/>
+      <w:lvlText w:val="o"/>
+      <w:lvlJc w:val="left"/>
+      <w:pPr>
+        <w:ind w:left="5760" w:hanging="360"/>
+      </w:pPr>
+      <w:rPr>
+        <w:rFonts w:ascii="Courier New" w:hAnsi="Courier New" w:cs="Courier New" w:hint="default"/>
+      </w:rPr>
+    </w:lvl>
+    <w:lvl w:ilvl="8" w:tplc="20000005" w:tentative="1">
+      <w:start w:val="1"/>
+      <w:numFmt w:val="bullet"/>
+      <w:lvlText w:val=""/>
+      <w:lvlJc w:val="left"/>
+      <w:pPr>
+        <w:ind w:left="6480" w:hanging="360"/>
+      </w:pPr>
+      <w:rPr>
+        <w:rFonts w:ascii="Wingdings" w:hAnsi="Wingdings" w:hint="default"/>
+      </w:rPr>
+    </w:lvl>
+  </w:abstractNum>
+  <w:num w:numId="1" w16cid:durableId="898709924">
+    <w:abstractNumId w:val="0"/>
+  </w:num>
+</w:numbering>
 </file>
 
 <file path=word/styles.xml><?xml version="1.0" encoding="utf-8"?>
@@ -807,7 +933,6 @@
   <w:style w:type="character" w:default="1" w:styleId="DefaultParagraphFont">
     <w:name w:val="Default Paragraph Font"/>
     <w:uiPriority w:val="1"/>
-    <w:semiHidden/>
     <w:unhideWhenUsed/>
   </w:style>
   <w:style w:type="table" w:default="1" w:styleId="TableNormal">

</xml_diff>

<commit_message>
Updated main document and slight update to vectorization function
</commit_message>
<xml_diff>
--- a/Gen AI Usage Journal.docx
+++ b/Gen AI Usage Journal.docx
@@ -194,6 +194,92 @@
           <w:lang w:val="en-MT"/>
         </w:rPr>
         <w:t xml:space="preserve"> from first dataset)</w:t>
+      </w:r>
+    </w:p>
+    <w:p>
+      <w:pPr>
+        <w:rPr>
+          <w:lang w:val="en-MT"/>
+        </w:rPr>
+      </w:pPr>
+    </w:p>
+    <w:p>
+      <w:pPr>
+        <w:rPr>
+          <w:b/>
+          <w:bCs/>
+          <w:i/>
+          <w:iCs/>
+          <w:sz w:val="28"/>
+          <w:szCs w:val="28"/>
+          <w:u w:val="single"/>
+          <w:lang w:val="en-US"/>
+        </w:rPr>
+      </w:pPr>
+      <w:r>
+        <w:rPr>
+          <w:b/>
+          <w:bCs/>
+          <w:i/>
+          <w:iCs/>
+          <w:sz w:val="28"/>
+          <w:szCs w:val="28"/>
+          <w:u w:val="single"/>
+          <w:lang w:val="en-US"/>
+        </w:rPr>
+        <w:t>ChatGPT</w:t>
+      </w:r>
+      <w:r>
+        <w:rPr>
+          <w:b/>
+          <w:bCs/>
+          <w:i/>
+          <w:iCs/>
+          <w:sz w:val="28"/>
+          <w:szCs w:val="28"/>
+          <w:u w:val="single"/>
+          <w:lang w:val="en-US"/>
+        </w:rPr>
+        <w:t xml:space="preserve"> – 2</w:t>
+      </w:r>
+      <w:r>
+        <w:rPr>
+          <w:b/>
+          <w:bCs/>
+          <w:i/>
+          <w:iCs/>
+          <w:sz w:val="28"/>
+          <w:szCs w:val="28"/>
+          <w:u w:val="single"/>
+          <w:lang w:val="en-US"/>
+        </w:rPr>
+        <w:t>3</w:t>
+      </w:r>
+      <w:r>
+        <w:rPr>
+          <w:b/>
+          <w:bCs/>
+          <w:i/>
+          <w:iCs/>
+          <w:sz w:val="28"/>
+          <w:szCs w:val="28"/>
+          <w:u w:val="single"/>
+          <w:lang w:val="en-US"/>
+        </w:rPr>
+        <w:t>/11/2025</w:t>
+      </w:r>
+    </w:p>
+    <w:p>
+      <w:pPr>
+        <w:rPr>
+          <w:lang w:val="en-MT"/>
+        </w:rPr>
+      </w:pPr>
+      <w:r>
+        <w:rPr>
+          <w:lang w:val="en-MT"/>
+        </w:rPr>
+        <w:t>I took ChatGPT’s advice on which vectorizer function works best for our case scenario.</w:t>
       </w:r>
     </w:p>
     <w:sectPr>
@@ -933,6 +1019,7 @@
   <w:style w:type="character" w:default="1" w:styleId="DefaultParagraphFont">
     <w:name w:val="Default Paragraph Font"/>
     <w:uiPriority w:val="1"/>
+    <w:semiHidden/>
     <w:unhideWhenUsed/>
   </w:style>
   <w:style w:type="table" w:default="1" w:styleId="TableNormal">

</xml_diff>

<commit_message>
Added to AI Journal
</commit_message>
<xml_diff>
--- a/Gen AI Usage Journal.docx
+++ b/Gen AI Usage Journal.docx
@@ -66,11 +66,15 @@
     <w:p>
       <w:pPr>
         <w:rPr>
-          <w:lang w:val="en-US"/>
-        </w:rPr>
-      </w:pPr>
-      <w:r>
-        <w:rPr>
+          <w:sz w:val="24"/>
+          <w:szCs w:val="24"/>
+          <w:lang w:val="en-US"/>
+        </w:rPr>
+      </w:pPr>
+      <w:r>
+        <w:rPr>
+          <w:sz w:val="24"/>
+          <w:szCs w:val="24"/>
           <w:lang w:val="en-US"/>
         </w:rPr>
         <w:t>I have used ChatGPT to help me format the README properly for readability on GitHub.</w:t>
@@ -113,19 +117,41 @@
     <w:p>
       <w:pPr>
         <w:rPr>
-          <w:lang w:val="en-US"/>
-        </w:rPr>
-      </w:pPr>
-      <w:r>
-        <w:rPr>
-          <w:lang w:val="en-US"/>
-        </w:rPr>
-        <w:t>I find Google Gemini to be useful in writing code snippets for functions/quick short code. Hence, I utilized it for variables/functions:</w:t>
+          <w:sz w:val="24"/>
+          <w:szCs w:val="24"/>
+          <w:lang w:val="en-US"/>
+        </w:rPr>
+      </w:pPr>
+      <w:r>
+        <w:rPr>
+          <w:sz w:val="24"/>
+          <w:szCs w:val="24"/>
+          <w:lang w:val="en-US"/>
+        </w:rPr>
+        <w:t>I find Google Gemini to be useful in writing code snippets for functions/quick short code. Hence, I utili</w:t>
+      </w:r>
+      <w:r>
+        <w:rPr>
+          <w:sz w:val="24"/>
+          <w:szCs w:val="24"/>
+          <w:lang w:val="en-US"/>
+        </w:rPr>
+        <w:t>s</w:t>
+      </w:r>
+      <w:r>
+        <w:rPr>
+          <w:sz w:val="24"/>
+          <w:szCs w:val="24"/>
+          <w:lang w:val="en-US"/>
+        </w:rPr>
+        <w:t>ed it for variables/functions:</w:t>
       </w:r>
     </w:p>
     <w:p>
       <w:pPr>
         <w:rPr>
+          <w:sz w:val="24"/>
+          <w:szCs w:val="24"/>
           <w:lang w:val="en-US"/>
         </w:rPr>
       </w:pPr>
@@ -138,22 +164,18 @@
           <w:numId w:val="1"/>
         </w:numPr>
         <w:rPr>
+          <w:sz w:val="24"/>
+          <w:szCs w:val="24"/>
           <w:lang w:val="en-MT"/>
         </w:rPr>
       </w:pPr>
-      <w:proofErr w:type="spellStart"/>
-      <w:r>
-        <w:rPr>
+      <w:r>
+        <w:rPr>
+          <w:sz w:val="24"/>
+          <w:szCs w:val="24"/>
           <w:lang w:val="en-MT"/>
         </w:rPr>
-        <w:t>merged_df_police_press</w:t>
-      </w:r>
-      <w:proofErr w:type="spellEnd"/>
-      <w:r>
-        <w:rPr>
-          <w:lang w:val="en-MT"/>
-        </w:rPr>
-        <w:t xml:space="preserve"> (Lambda expression comparison)</w:t>
+        <w:t>merged_df_police_press (Lambda expression comparison)</w:t>
       </w:r>
     </w:p>
     <w:p>
@@ -164,36 +186,18 @@
           <w:numId w:val="1"/>
         </w:numPr>
         <w:rPr>
+          <w:sz w:val="24"/>
+          <w:szCs w:val="24"/>
           <w:lang w:val="en-MT"/>
         </w:rPr>
       </w:pPr>
-      <w:proofErr w:type="spellStart"/>
-      <w:r>
-        <w:rPr>
+      <w:r>
+        <w:rPr>
+          <w:sz w:val="24"/>
+          <w:szCs w:val="24"/>
           <w:lang w:val="en-MT"/>
         </w:rPr>
-        <w:t>assign_tags</w:t>
-      </w:r>
-      <w:proofErr w:type="spellEnd"/>
-      <w:r>
-        <w:rPr>
-          <w:lang w:val="en-MT"/>
-        </w:rPr>
-        <w:t xml:space="preserve"> function (Extract top 5 tags and their </w:t>
-      </w:r>
-      <w:proofErr w:type="spellStart"/>
-      <w:r>
-        <w:rPr>
-          <w:lang w:val="en-MT"/>
-        </w:rPr>
-        <w:t>freq</w:t>
-      </w:r>
-      <w:proofErr w:type="spellEnd"/>
-      <w:r>
-        <w:rPr>
-          <w:lang w:val="en-MT"/>
-        </w:rPr>
-        <w:t xml:space="preserve"> from first dataset)</w:t>
+        <w:t>assign_tags function (Extract top 5 tags and their freq from first dataset)</w:t>
       </w:r>
     </w:p>
     <w:p>
@@ -240,47 +244,200 @@
           <w:u w:val="single"/>
           <w:lang w:val="en-US"/>
         </w:rPr>
-        <w:t xml:space="preserve"> – 2</w:t>
-      </w:r>
-      <w:r>
+        <w:t xml:space="preserve"> – 23/11/2025</w:t>
+      </w:r>
+    </w:p>
+    <w:p>
+      <w:pPr>
         <w:rPr>
           <w:b/>
           <w:bCs/>
-          <w:i/>
-          <w:iCs/>
-          <w:sz w:val="28"/>
-          <w:szCs w:val="28"/>
-          <w:u w:val="single"/>
-          <w:lang w:val="en-US"/>
-        </w:rPr>
-        <w:t>3</w:t>
+          <w:sz w:val="36"/>
+          <w:szCs w:val="36"/>
+          <w:lang w:val="en-US"/>
+        </w:rPr>
+      </w:pPr>
+      <w:r>
+        <w:rPr>
+          <w:sz w:val="24"/>
+          <w:szCs w:val="24"/>
+          <w:lang w:val="en-MT"/>
+        </w:rPr>
+        <w:t>I took ChatGPT’s advice on which vectorizer function works best for our case scenario.</w:t>
+      </w:r>
+      <w:r>
+        <w:rPr>
+          <w:lang w:val="en-MT"/>
+        </w:rPr>
+        <w:br/>
+      </w:r>
+      <w:r>
+        <w:rPr>
+          <w:lang w:val="en-MT"/>
+        </w:rPr>
+        <w:br/>
+      </w:r>
+      <w:r>
+        <w:rPr>
+          <w:lang w:val="en-MT"/>
+        </w:rPr>
+        <w:br/>
+      </w:r>
+      <w:r>
+        <w:rPr>
+          <w:lang w:val="en-MT"/>
+        </w:rPr>
+        <w:br/>
       </w:r>
       <w:r>
         <w:rPr>
           <w:b/>
           <w:bCs/>
-          <w:i/>
-          <w:iCs/>
-          <w:sz w:val="28"/>
-          <w:szCs w:val="28"/>
-          <w:u w:val="single"/>
-          <w:lang w:val="en-US"/>
-        </w:rPr>
-        <w:t>/11/2025</w:t>
+          <w:sz w:val="36"/>
+          <w:szCs w:val="36"/>
+          <w:lang w:val="en-US"/>
+        </w:rPr>
+        <w:t>Luca D’Ascari</w:t>
       </w:r>
     </w:p>
     <w:p>
       <w:pPr>
-        <w:rPr>
-          <w:lang w:val="en-MT"/>
-        </w:rPr>
-      </w:pPr>
-      <w:r>
-        <w:rPr>
-          <w:lang w:val="en-MT"/>
-        </w:rPr>
-        <w:t>I took ChatGPT’s advice on which vectorizer function works best for our case scenario.</w:t>
-      </w:r>
+        <w:pStyle w:val="p3"/>
+        <w:rPr>
+          <w:rFonts w:asciiTheme="minorHAnsi" w:eastAsiaTheme="minorHAnsi" w:hAnsiTheme="minorHAnsi" w:cstheme="minorBidi"/>
+          <w:kern w:val="2"/>
+          <w:lang w:eastAsia="en-US"/>
+          <w14:ligatures w14:val="standardContextual"/>
+        </w:rPr>
+      </w:pPr>
+      <w:r>
+        <w:rPr>
+          <w:rFonts w:asciiTheme="minorHAnsi" w:eastAsiaTheme="minorHAnsi" w:hAnsiTheme="minorHAnsi" w:cstheme="minorBidi"/>
+          <w:kern w:val="2"/>
+          <w:lang w:eastAsia="en-US"/>
+          <w14:ligatures w14:val="standardContextual"/>
+        </w:rPr>
+        <w:t>This work was completed using a mix of AI tools to support structure, quality assurance, and writing clarity.  GPT was used primarily to help structure Notebook</w:t>
+      </w:r>
+      <w:r>
+        <w:rPr>
+          <w:rFonts w:asciiTheme="minorHAnsi" w:eastAsiaTheme="minorHAnsi" w:hAnsiTheme="minorHAnsi" w:cstheme="minorBidi"/>
+          <w:kern w:val="2"/>
+          <w:lang w:eastAsia="en-US"/>
+          <w14:ligatures w14:val="standardContextual"/>
+        </w:rPr>
+        <w:t>s 3 and</w:t>
+      </w:r>
+      <w:r>
+        <w:rPr>
+          <w:rFonts w:asciiTheme="minorHAnsi" w:eastAsiaTheme="minorHAnsi" w:hAnsiTheme="minorHAnsi" w:cstheme="minorBidi"/>
+          <w:kern w:val="2"/>
+          <w:lang w:eastAsia="en-US"/>
+          <w14:ligatures w14:val="standardContextual"/>
+        </w:rPr>
+        <w:t xml:space="preserve"> 4 into a report</w:t>
+      </w:r>
+      <w:r>
+        <w:rPr>
+          <w:rFonts w:asciiTheme="minorHAnsi" w:eastAsiaTheme="minorHAnsi" w:hAnsiTheme="minorHAnsi" w:cstheme="minorBidi"/>
+          <w:kern w:val="2"/>
+          <w:lang w:eastAsia="en-US"/>
+          <w14:ligatures w14:val="standardContextual"/>
+        </w:rPr>
+        <w:t>-</w:t>
+      </w:r>
+      <w:r>
+        <w:rPr>
+          <w:rFonts w:asciiTheme="minorHAnsi" w:eastAsiaTheme="minorHAnsi" w:hAnsiTheme="minorHAnsi" w:cstheme="minorBidi"/>
+          <w:kern w:val="2"/>
+          <w:lang w:eastAsia="en-US"/>
+          <w14:ligatures w14:val="standardContextual"/>
+        </w:rPr>
+        <w:t xml:space="preserve">style narrative aligned with the </w:t>
+      </w:r>
+      <w:r>
+        <w:rPr>
+          <w:rFonts w:asciiTheme="minorHAnsi" w:eastAsiaTheme="minorHAnsi" w:hAnsiTheme="minorHAnsi" w:cstheme="minorBidi"/>
+          <w:kern w:val="2"/>
+          <w:lang w:eastAsia="en-US"/>
+          <w14:ligatures w14:val="standardContextual"/>
+        </w:rPr>
+        <w:t>assignment</w:t>
+      </w:r>
+      <w:r>
+        <w:rPr>
+          <w:rFonts w:asciiTheme="minorHAnsi" w:eastAsiaTheme="minorHAnsi" w:hAnsiTheme="minorHAnsi" w:cstheme="minorBidi"/>
+          <w:kern w:val="2"/>
+          <w:lang w:eastAsia="en-US"/>
+          <w14:ligatures w14:val="standardContextual"/>
+        </w:rPr>
+        <w:t xml:space="preserve"> brief, including shaping the comparative evaluation flow, drafting </w:t>
+      </w:r>
+      <w:r>
+        <w:rPr>
+          <w:rFonts w:asciiTheme="minorHAnsi" w:eastAsiaTheme="minorHAnsi" w:hAnsiTheme="minorHAnsi" w:cstheme="minorBidi"/>
+          <w:kern w:val="2"/>
+          <w:lang w:eastAsia="en-US"/>
+          <w14:ligatures w14:val="standardContextual"/>
+        </w:rPr>
+        <w:t>shortened</w:t>
+      </w:r>
+      <w:r>
+        <w:rPr>
+          <w:rFonts w:asciiTheme="minorHAnsi" w:eastAsiaTheme="minorHAnsi" w:hAnsiTheme="minorHAnsi" w:cstheme="minorBidi"/>
+          <w:kern w:val="2"/>
+          <w:lang w:eastAsia="en-US"/>
+          <w14:ligatures w14:val="standardContextual"/>
+        </w:rPr>
+        <w:t xml:space="preserve"> markdown sections, and refining wording so that claims matched the quantitative outputs.  Gemini was used as a secondary tool to cross</w:t>
+      </w:r>
+      <w:r>
+        <w:rPr>
+          <w:rFonts w:asciiTheme="minorHAnsi" w:eastAsiaTheme="minorHAnsi" w:hAnsiTheme="minorHAnsi" w:cstheme="minorBidi"/>
+          <w:kern w:val="2"/>
+          <w:lang w:eastAsia="en-US"/>
+          <w14:ligatures w14:val="standardContextual"/>
+        </w:rPr>
+        <w:t>-</w:t>
+      </w:r>
+      <w:r>
+        <w:rPr>
+          <w:rFonts w:asciiTheme="minorHAnsi" w:eastAsiaTheme="minorHAnsi" w:hAnsiTheme="minorHAnsi" w:cstheme="minorBidi"/>
+          <w:kern w:val="2"/>
+          <w:lang w:eastAsia="en-US"/>
+          <w14:ligatures w14:val="standardContextual"/>
+        </w:rPr>
+        <w:t>check section completeness against the brief and to sanity check whether the interpretations were consistent with the reported metrics, plots, and significance testing.</w:t>
+      </w:r>
+    </w:p>
+    <w:p>
+      <w:pPr>
+        <w:pStyle w:val="p3"/>
+        <w:rPr>
+          <w:rFonts w:asciiTheme="minorHAnsi" w:eastAsiaTheme="minorHAnsi" w:hAnsiTheme="minorHAnsi" w:cstheme="minorBidi"/>
+          <w:kern w:val="2"/>
+          <w:lang w:eastAsia="en-US"/>
+          <w14:ligatures w14:val="standardContextual"/>
+        </w:rPr>
+      </w:pPr>
+      <w:r>
+        <w:rPr>
+          <w:rFonts w:asciiTheme="minorHAnsi" w:eastAsiaTheme="minorHAnsi" w:hAnsiTheme="minorHAnsi" w:cstheme="minorBidi"/>
+          <w:kern w:val="2"/>
+          <w:lang w:eastAsia="en-US"/>
+          <w14:ligatures w14:val="standardContextual"/>
+        </w:rPr>
+        <w:t>Where AI suggestions influenced decisions, the final choices were still implemented and validated inside the notebook through reproducible code and outputs rather than accepted as unverified text.  An honourable mention is Grammarly, which was used during the final polishing stage to correct grammar and improve written British English readability without changing the underlying technical meaning.</w:t>
+      </w:r>
+    </w:p>
+    <w:p>
+      <w:pPr>
+        <w:rPr>
+          <w:sz w:val="24"/>
+          <w:szCs w:val="24"/>
+          <w:lang w:val="en-US"/>
+        </w:rPr>
+      </w:pPr>
     </w:p>
     <w:sectPr>
       <w:pgSz w:w="11906" w:h="16838"/>
@@ -1346,6 +1503,43 @@
       <w:spacing w:val="5"/>
     </w:rPr>
   </w:style>
+  <w:style w:type="paragraph" w:customStyle="1" w:styleId="p2">
+    <w:name w:val="p2"/>
+    <w:basedOn w:val="Normal"/>
+    <w:rsid w:val="00BC594C"/>
+    <w:pPr>
+      <w:spacing w:before="100" w:beforeAutospacing="1" w:after="100" w:afterAutospacing="1" w:line="240" w:lineRule="auto"/>
+    </w:pPr>
+    <w:rPr>
+      <w:rFonts w:ascii="Times New Roman" w:eastAsia="Times New Roman" w:hAnsi="Times New Roman" w:cs="Times New Roman"/>
+      <w:kern w:val="0"/>
+      <w:sz w:val="24"/>
+      <w:szCs w:val="24"/>
+      <w:lang w:val="en-MT" w:eastAsia="en-GB"/>
+      <w14:ligatures w14:val="none"/>
+    </w:rPr>
+  </w:style>
+  <w:style w:type="paragraph" w:customStyle="1" w:styleId="p3">
+    <w:name w:val="p3"/>
+    <w:basedOn w:val="Normal"/>
+    <w:rsid w:val="00BC594C"/>
+    <w:pPr>
+      <w:spacing w:before="100" w:beforeAutospacing="1" w:after="100" w:afterAutospacing="1" w:line="240" w:lineRule="auto"/>
+    </w:pPr>
+    <w:rPr>
+      <w:rFonts w:ascii="Times New Roman" w:eastAsia="Times New Roman" w:hAnsi="Times New Roman" w:cs="Times New Roman"/>
+      <w:kern w:val="0"/>
+      <w:sz w:val="24"/>
+      <w:szCs w:val="24"/>
+      <w:lang w:val="en-MT" w:eastAsia="en-GB"/>
+      <w14:ligatures w14:val="none"/>
+    </w:rPr>
+  </w:style>
+  <w:style w:type="character" w:customStyle="1" w:styleId="apple-converted-space">
+    <w:name w:val="apple-converted-space"/>
+    <w:basedOn w:val="DefaultParagraphFont"/>
+    <w:rsid w:val="00BC594C"/>
+  </w:style>
 </w:styles>
 </file>
 

</xml_diff>

<commit_message>
Cleaning up the GIT
</commit_message>
<xml_diff>
--- a/Gen AI Usage Journal.docx
+++ b/Gen AI Usage Journal.docx
@@ -1,6 +1,6 @@
 
 <file path=word/document.xml><?xml version="1.0" encoding="utf-8"?>
-<w:document xmlns:wpc="http://schemas.microsoft.com/office/word/2010/wordprocessingCanvas" xmlns:cx="http://schemas.microsoft.com/office/drawing/2014/chartex" xmlns:cx1="http://schemas.microsoft.com/office/drawing/2015/9/8/chartex" xmlns:cx2="http://schemas.microsoft.com/office/drawing/2015/10/21/chartex" xmlns:cx3="http://schemas.microsoft.com/office/drawing/2016/5/9/chartex" xmlns:cx4="http://schemas.microsoft.com/office/drawing/2016/5/10/chartex" xmlns:cx5="http://schemas.microsoft.com/office/drawing/2016/5/11/chartex" xmlns:cx6="http://schemas.microsoft.com/office/drawing/2016/5/12/chartex" xmlns:cx7="http://schemas.microsoft.com/office/drawing/2016/5/13/chartex" xmlns:cx8="http://schemas.microsoft.com/office/drawing/2016/5/14/chartex" xmlns:mc="http://schemas.openxmlformats.org/markup-compatibility/2006" xmlns:aink="http://schemas.microsoft.com/office/drawing/2016/ink" xmlns:am3d="http://schemas.microsoft.com/office/drawing/2017/model3d" xmlns:o="urn:schemas-microsoft-com:office:office" xmlns:oel="http://schemas.microsoft.com/office/2019/extlst" xmlns:r="http://schemas.openxmlformats.org/officeDocument/2006/relationships" xmlns:m="http://schemas.openxmlformats.org/officeDocument/2006/math" xmlns:v="urn:schemas-microsoft-com:vml" xmlns:wp14="http://schemas.microsoft.com/office/word/2010/wordprocessingDrawing" xmlns:wp="http://schemas.openxmlformats.org/drawingml/2006/wordprocessingDrawing" xmlns:w10="urn:schemas-microsoft-com:office:word" xmlns:w="http://schemas.openxmlformats.org/wordprocessingml/2006/main" xmlns:w14="http://schemas.microsoft.com/office/word/2010/wordml" xmlns:w15="http://schemas.microsoft.com/office/word/2012/wordml" xmlns:w16cex="http://schemas.microsoft.com/office/word/2018/wordml/cex" xmlns:w16cid="http://schemas.microsoft.com/office/word/2016/wordml/cid" xmlns:w16="http://schemas.microsoft.com/office/word/2018/wordml" xmlns:w16du="http://schemas.microsoft.com/office/word/2023/wordml/word16du" xmlns:w16sdtdh="http://schemas.microsoft.com/office/word/2020/wordml/sdtdatahash" xmlns:w16sdtfl="http://schemas.microsoft.com/office/word/2024/wordml/sdtformatlock" xmlns:w16se="http://schemas.microsoft.com/office/word/2015/wordml/symex" xmlns:wpg="http://schemas.microsoft.com/office/word/2010/wordprocessingGroup" xmlns:wpi="http://schemas.microsoft.com/office/word/2010/wordprocessingInk" xmlns:wne="http://schemas.microsoft.com/office/word/2006/wordml" xmlns:wps="http://schemas.microsoft.com/office/word/2010/wordprocessingShape" mc:Ignorable="w14 w15 w16se w16cid w16 w16cex w16sdtdh w16sdtfl w16du wp14">
+<w:document xmlns:wpc="http://schemas.microsoft.com/office/word/2010/wordprocessingCanvas" xmlns:cx="http://schemas.microsoft.com/office/drawing/2014/chartex" xmlns:cx1="http://schemas.microsoft.com/office/drawing/2015/9/8/chartex" xmlns:cx2="http://schemas.microsoft.com/office/drawing/2015/10/21/chartex" xmlns:cx3="http://schemas.microsoft.com/office/drawing/2016/5/9/chartex" xmlns:cx4="http://schemas.microsoft.com/office/drawing/2016/5/10/chartex" xmlns:cx5="http://schemas.microsoft.com/office/drawing/2016/5/11/chartex" xmlns:cx6="http://schemas.microsoft.com/office/drawing/2016/5/12/chartex" xmlns:cx7="http://schemas.microsoft.com/office/drawing/2016/5/13/chartex" xmlns:cx8="http://schemas.microsoft.com/office/drawing/2016/5/14/chartex" xmlns:mc="http://schemas.openxmlformats.org/markup-compatibility/2006" xmlns:aink="http://schemas.microsoft.com/office/drawing/2016/ink" xmlns:am3d="http://schemas.microsoft.com/office/drawing/2017/model3d" xmlns:o="urn:schemas-microsoft-com:office:office" xmlns:oel="http://schemas.microsoft.com/office/2019/extlst" xmlns:r="http://schemas.openxmlformats.org/officeDocument/2006/relationships" xmlns:m="http://schemas.openxmlformats.org/officeDocument/2006/math" xmlns:v="urn:schemas-microsoft-com:vml" xmlns:wp14="http://schemas.microsoft.com/office/word/2010/wordprocessingDrawing" xmlns:wp="http://schemas.openxmlformats.org/drawingml/2006/wordprocessingDrawing" xmlns:w10="urn:schemas-microsoft-com:office:word" xmlns:w="http://schemas.openxmlformats.org/wordprocessingml/2006/main" xmlns:w14="http://schemas.microsoft.com/office/word/2010/wordml" xmlns:w15="http://schemas.microsoft.com/office/word/2012/wordml" xmlns:w16cex="http://schemas.microsoft.com/office/word/2018/wordml/cex" xmlns:w16cid="http://schemas.microsoft.com/office/word/2016/wordml/cid" xmlns:w16="http://schemas.microsoft.com/office/word/2018/wordml" xmlns:w16sdtdh="http://schemas.microsoft.com/office/word/2020/wordml/sdtdatahash" xmlns:w16se="http://schemas.microsoft.com/office/word/2015/wordml/symex" xmlns:wpg="http://schemas.microsoft.com/office/word/2010/wordprocessingGroup" xmlns:wpi="http://schemas.microsoft.com/office/word/2010/wordprocessingInk" xmlns:wne="http://schemas.microsoft.com/office/word/2006/wordml" xmlns:wps="http://schemas.microsoft.com/office/word/2010/wordprocessingShape" mc:Ignorable="w14 w15 w16se w16cid w16 w16cex w16sdtdh wp14">
   <w:body>
     <w:p>
       <w:pPr>
@@ -166,14 +166,14 @@
         <w:rPr>
           <w:sz w:val="24"/>
           <w:szCs w:val="24"/>
-          <w:lang w:val="en-MT"/>
+          <w:lang/>
         </w:rPr>
       </w:pPr>
       <w:r>
         <w:rPr>
           <w:sz w:val="24"/>
           <w:szCs w:val="24"/>
-          <w:lang w:val="en-MT"/>
+          <w:lang/>
         </w:rPr>
         <w:t>merged_df_police_press (Lambda expression comparison)</w:t>
       </w:r>
@@ -188,14 +188,14 @@
         <w:rPr>
           <w:sz w:val="24"/>
           <w:szCs w:val="24"/>
-          <w:lang w:val="en-MT"/>
+          <w:lang/>
         </w:rPr>
       </w:pPr>
       <w:r>
         <w:rPr>
           <w:sz w:val="24"/>
           <w:szCs w:val="24"/>
-          <w:lang w:val="en-MT"/>
+          <w:lang/>
         </w:rPr>
         <w:t>assign_tags function (Extract top 5 tags and their freq from first dataset)</w:t>
       </w:r>
@@ -203,7 +203,7 @@
     <w:p>
       <w:pPr>
         <w:rPr>
-          <w:lang w:val="en-MT"/>
+          <w:lang/>
         </w:rPr>
       </w:pPr>
     </w:p>
@@ -261,31 +261,31 @@
         <w:rPr>
           <w:sz w:val="24"/>
           <w:szCs w:val="24"/>
-          <w:lang w:val="en-MT"/>
+          <w:lang/>
         </w:rPr>
         <w:t>I took ChatGPT’s advice on which vectorizer function works best for our case scenario.</w:t>
       </w:r>
       <w:r>
         <w:rPr>
-          <w:lang w:val="en-MT"/>
+          <w:lang/>
         </w:rPr>
         <w:br/>
       </w:r>
       <w:r>
         <w:rPr>
-          <w:lang w:val="en-MT"/>
+          <w:lang/>
         </w:rPr>
         <w:br/>
       </w:r>
       <w:r>
         <w:rPr>
-          <w:lang w:val="en-MT"/>
+          <w:lang/>
         </w:rPr>
         <w:br/>
       </w:r>
       <w:r>
         <w:rPr>
-          <w:lang w:val="en-MT"/>
+          <w:lang/>
         </w:rPr>
         <w:br/>
       </w:r>
@@ -433,11 +433,61 @@
     <w:p>
       <w:pPr>
         <w:rPr>
+          <w:b/>
+          <w:bCs/>
+          <w:sz w:val="36"/>
+          <w:szCs w:val="36"/>
+          <w:lang w:val="en-US"/>
+        </w:rPr>
+      </w:pPr>
+      <w:r>
+        <w:rPr>
+          <w:b/>
+          <w:bCs/>
+          <w:sz w:val="36"/>
+          <w:szCs w:val="36"/>
+          <w:lang w:val="en-US"/>
+        </w:rPr>
+        <w:t>Lu</w:t>
+      </w:r>
+      <w:r>
+        <w:rPr>
+          <w:b/>
+          <w:bCs/>
+          <w:sz w:val="36"/>
+          <w:szCs w:val="36"/>
+          <w:lang w:val="en-US"/>
+        </w:rPr>
+        <w:t>ke Cardona</w:t>
+      </w:r>
+      <w:r>
+        <w:rPr>
+          <w:b/>
+          <w:bCs/>
+          <w:sz w:val="36"/>
+          <w:szCs w:val="36"/>
+          <w:lang w:val="en-US"/>
+        </w:rPr>
+        <w:tab/>
+      </w:r>
+    </w:p>
+    <w:p>
+      <w:r>
+        <w:t xml:space="preserve">I have made use of the AI tools to aid in clarity of the code and to summarise papers. ChatGPT and Gemini were used to aid in structuring the code and to aid in the creation of the appropriate figures and organising the figures for the EDA. </w:t>
+      </w:r>
+    </w:p>
+    <w:p>
+      <w:pPr>
+        <w:rPr>
           <w:sz w:val="24"/>
           <w:szCs w:val="24"/>
           <w:lang w:val="en-US"/>
         </w:rPr>
       </w:pPr>
+      <w:r>
+        <w:lastRenderedPageBreak/>
+        <w:t xml:space="preserve">Notebook LLM was used to summarise the papers at first to filter out the papers and knowledge. Chat GPT was used to aid in writing the markdown for the Notebook. This was done by giving the LLM a list of bullet points and then prompting the LLM to give the bullet points in a structured paragraph. </w:t>
+      </w:r>
     </w:p>
     <w:sectPr>
       <w:pgSz w:w="11906" w:h="16838"/>
@@ -450,7 +500,7 @@
 </file>
 
 <file path=word/numbering.xml><?xml version="1.0" encoding="utf-8"?>
-<w:numbering xmlns:wpc="http://schemas.microsoft.com/office/word/2010/wordprocessingCanvas" xmlns:cx="http://schemas.microsoft.com/office/drawing/2014/chartex" xmlns:cx1="http://schemas.microsoft.com/office/drawing/2015/9/8/chartex" xmlns:cx2="http://schemas.microsoft.com/office/drawing/2015/10/21/chartex" xmlns:cx3="http://schemas.microsoft.com/office/drawing/2016/5/9/chartex" xmlns:cx4="http://schemas.microsoft.com/office/drawing/2016/5/10/chartex" xmlns:cx5="http://schemas.microsoft.com/office/drawing/2016/5/11/chartex" xmlns:cx6="http://schemas.microsoft.com/office/drawing/2016/5/12/chartex" xmlns:cx7="http://schemas.microsoft.com/office/drawing/2016/5/13/chartex" xmlns:cx8="http://schemas.microsoft.com/office/drawing/2016/5/14/chartex" xmlns:mc="http://schemas.openxmlformats.org/markup-compatibility/2006" xmlns:aink="http://schemas.microsoft.com/office/drawing/2016/ink" xmlns:am3d="http://schemas.microsoft.com/office/drawing/2017/model3d" xmlns:o="urn:schemas-microsoft-com:office:office" xmlns:oel="http://schemas.microsoft.com/office/2019/extlst" xmlns:r="http://schemas.openxmlformats.org/officeDocument/2006/relationships" xmlns:m="http://schemas.openxmlformats.org/officeDocument/2006/math" xmlns:v="urn:schemas-microsoft-com:vml" xmlns:wp14="http://schemas.microsoft.com/office/word/2010/wordprocessingDrawing" xmlns:wp="http://schemas.openxmlformats.org/drawingml/2006/wordprocessingDrawing" xmlns:w10="urn:schemas-microsoft-com:office:word" xmlns:w="http://schemas.openxmlformats.org/wordprocessingml/2006/main" xmlns:w14="http://schemas.microsoft.com/office/word/2010/wordml" xmlns:w15="http://schemas.microsoft.com/office/word/2012/wordml" xmlns:w16cex="http://schemas.microsoft.com/office/word/2018/wordml/cex" xmlns:w16cid="http://schemas.microsoft.com/office/word/2016/wordml/cid" xmlns:w16="http://schemas.microsoft.com/office/word/2018/wordml" xmlns:w16du="http://schemas.microsoft.com/office/word/2023/wordml/word16du" xmlns:w16sdtdh="http://schemas.microsoft.com/office/word/2020/wordml/sdtdatahash" xmlns:w16sdtfl="http://schemas.microsoft.com/office/word/2024/wordml/sdtformatlock" xmlns:w16se="http://schemas.microsoft.com/office/word/2015/wordml/symex" xmlns:wpg="http://schemas.microsoft.com/office/word/2010/wordprocessingGroup" xmlns:wpi="http://schemas.microsoft.com/office/word/2010/wordprocessingInk" xmlns:wne="http://schemas.microsoft.com/office/word/2006/wordml" xmlns:wps="http://schemas.microsoft.com/office/word/2010/wordprocessingShape" mc:Ignorable="w14 w15 w16se w16cid w16 w16cex w16sdtdh w16sdtfl w16du wp14">
+<w:numbering xmlns:wpc="http://schemas.microsoft.com/office/word/2010/wordprocessingCanvas" xmlns:cx="http://schemas.microsoft.com/office/drawing/2014/chartex" xmlns:cx1="http://schemas.microsoft.com/office/drawing/2015/9/8/chartex" xmlns:cx2="http://schemas.microsoft.com/office/drawing/2015/10/21/chartex" xmlns:cx3="http://schemas.microsoft.com/office/drawing/2016/5/9/chartex" xmlns:cx4="http://schemas.microsoft.com/office/drawing/2016/5/10/chartex" xmlns:cx5="http://schemas.microsoft.com/office/drawing/2016/5/11/chartex" xmlns:cx6="http://schemas.microsoft.com/office/drawing/2016/5/12/chartex" xmlns:cx7="http://schemas.microsoft.com/office/drawing/2016/5/13/chartex" xmlns:cx8="http://schemas.microsoft.com/office/drawing/2016/5/14/chartex" xmlns:mc="http://schemas.openxmlformats.org/markup-compatibility/2006" xmlns:aink="http://schemas.microsoft.com/office/drawing/2016/ink" xmlns:am3d="http://schemas.microsoft.com/office/drawing/2017/model3d" xmlns:o="urn:schemas-microsoft-com:office:office" xmlns:oel="http://schemas.microsoft.com/office/2019/extlst" xmlns:r="http://schemas.openxmlformats.org/officeDocument/2006/relationships" xmlns:m="http://schemas.openxmlformats.org/officeDocument/2006/math" xmlns:v="urn:schemas-microsoft-com:vml" xmlns:wp14="http://schemas.microsoft.com/office/word/2010/wordprocessingDrawing" xmlns:wp="http://schemas.openxmlformats.org/drawingml/2006/wordprocessingDrawing" xmlns:w10="urn:schemas-microsoft-com:office:word" xmlns:w="http://schemas.openxmlformats.org/wordprocessingml/2006/main" xmlns:w14="http://schemas.microsoft.com/office/word/2010/wordml" xmlns:w15="http://schemas.microsoft.com/office/word/2012/wordml" xmlns:w16cex="http://schemas.microsoft.com/office/word/2018/wordml/cex" xmlns:w16cid="http://schemas.microsoft.com/office/word/2016/wordml/cid" xmlns:w16="http://schemas.microsoft.com/office/word/2018/wordml" xmlns:w16sdtdh="http://schemas.microsoft.com/office/word/2020/wordml/sdtdatahash" xmlns:w16se="http://schemas.microsoft.com/office/word/2015/wordml/symex" xmlns:wpg="http://schemas.microsoft.com/office/word/2010/wordprocessingGroup" xmlns:wpi="http://schemas.microsoft.com/office/word/2010/wordprocessingInk" xmlns:wne="http://schemas.microsoft.com/office/word/2006/wordml" xmlns:wps="http://schemas.microsoft.com/office/word/2010/wordprocessingShape" mc:Ignorable="w14 w15 w16se w16cid w16 w16cex w16sdtdh wp14">
   <w:abstractNum w:abstractNumId="0" w15:restartNumberingAfterBreak="0">
     <w:nsid w:val="02C029D1"/>
     <w:multiLevelType w:val="hybridMultilevel"/>
@@ -571,7 +621,7 @@
 </file>
 
 <file path=word/styles.xml><?xml version="1.0" encoding="utf-8"?>
-<w:styles xmlns:mc="http://schemas.openxmlformats.org/markup-compatibility/2006" xmlns:r="http://schemas.openxmlformats.org/officeDocument/2006/relationships" xmlns:w="http://schemas.openxmlformats.org/wordprocessingml/2006/main" xmlns:w14="http://schemas.microsoft.com/office/word/2010/wordml" xmlns:w15="http://schemas.microsoft.com/office/word/2012/wordml" xmlns:w16cex="http://schemas.microsoft.com/office/word/2018/wordml/cex" xmlns:w16cid="http://schemas.microsoft.com/office/word/2016/wordml/cid" xmlns:w16="http://schemas.microsoft.com/office/word/2018/wordml" xmlns:w16du="http://schemas.microsoft.com/office/word/2023/wordml/word16du" xmlns:w16sdtdh="http://schemas.microsoft.com/office/word/2020/wordml/sdtdatahash" xmlns:w16sdtfl="http://schemas.microsoft.com/office/word/2024/wordml/sdtformatlock" xmlns:w16se="http://schemas.microsoft.com/office/word/2015/wordml/symex" mc:Ignorable="w14 w15 w16se w16cid w16 w16cex w16sdtdh w16sdtfl w16du">
+<w:styles xmlns:mc="http://schemas.openxmlformats.org/markup-compatibility/2006" xmlns:r="http://schemas.openxmlformats.org/officeDocument/2006/relationships" xmlns:w="http://schemas.openxmlformats.org/wordprocessingml/2006/main" xmlns:w14="http://schemas.microsoft.com/office/word/2010/wordml" xmlns:w15="http://schemas.microsoft.com/office/word/2012/wordml" xmlns:w16cex="http://schemas.microsoft.com/office/word/2018/wordml/cex" xmlns:w16cid="http://schemas.microsoft.com/office/word/2016/wordml/cid" xmlns:w16="http://schemas.microsoft.com/office/word/2018/wordml" xmlns:w16sdtdh="http://schemas.microsoft.com/office/word/2020/wordml/sdtdatahash" xmlns:w16se="http://schemas.microsoft.com/office/word/2015/wordml/symex" mc:Ignorable="w14 w15 w16se w16cid w16 w16cex w16sdtdh">
   <w:docDefaults>
     <w:rPrDefault>
       <w:rPr>
@@ -579,7 +629,7 @@
         <w:kern w:val="2"/>
         <w:sz w:val="22"/>
         <w:szCs w:val="22"/>
-        <w:lang w:val="en-MT" w:eastAsia="en-US" w:bidi="ar-SA"/>
+        <w:lang w:eastAsia="en-US" w:bidi="ar-SA"/>
         <w14:ligatures w14:val="standardContextual"/>
       </w:rPr>
     </w:rPrDefault>
@@ -1515,7 +1565,7 @@
       <w:kern w:val="0"/>
       <w:sz w:val="24"/>
       <w:szCs w:val="24"/>
-      <w:lang w:val="en-MT" w:eastAsia="en-GB"/>
+      <w:lang w:eastAsia="en-GB"/>
       <w14:ligatures w14:val="none"/>
     </w:rPr>
   </w:style>
@@ -1531,7 +1581,7 @@
       <w:kern w:val="0"/>
       <w:sz w:val="24"/>
       <w:szCs w:val="24"/>
-      <w:lang w:val="en-MT" w:eastAsia="en-GB"/>
+      <w:lang w:eastAsia="en-GB"/>
       <w14:ligatures w14:val="none"/>
     </w:rPr>
   </w:style>

</xml_diff>